<commit_message>
Volume 1, Chapter 5: updated lessons
</commit_message>
<xml_diff>
--- a/Volume 1/Chapter 05 - CRUD Applications/SPA_Vol1_Ch5_Lesson5_2_Read_Records.docx
+++ b/Volume 1/Chapter 05 - CRUD Applications/SPA_Vol1_Ch5_Lesson5_2_Read_Records.docx
@@ -1015,6 +1015,7 @@
         <w:pStyle w:val="CommandBlock"/>
       </w:pPr>
       <w:r>
+        <w:lastRenderedPageBreak/>
         <w:t xml:space="preserve">  cpp/main.cpp</w:t>
       </w:r>
     </w:p>
@@ -4696,23 +4697,23 @@
         <w:pStyle w:val="SourceCode"/>
       </w:pPr>
       <w:r>
-        <w:t>// Remember, read_answer (Lesson 5.1) copies the typed line into answer,</w:t>
-      </w:r>
-    </w:p>
-    <w:p>
-      <w:pPr>
-        <w:pStyle w:val="SourceCode"/>
-      </w:pPr>
-      <w:r>
-        <w:t>// without its \n, and returns true when a line was read or false when</w:t>
-      </w:r>
-    </w:p>
-    <w:p>
-      <w:pPr>
-        <w:pStyle w:val="SourceCode"/>
-      </w:pPr>
-      <w:r>
-        <w:t>// the input had ended; then answer stays empty.</w:t>
+        <w:t>// Remember, read_answer (Lesson 5.1) fills answer without its \n and</w:t>
+      </w:r>
+    </w:p>
+    <w:p>
+      <w:pPr>
+        <w:pStyle w:val="SourceCode"/>
+      </w:pPr>
+      <w:r>
+        <w:t>// returns true, or false when the input had ended; fgetc drops the rest</w:t>
+      </w:r>
+    </w:p>
+    <w:p>
+      <w:pPr>
+        <w:pStyle w:val="SourceCode"/>
+      </w:pPr>
+      <w:r>
+        <w:t>// of a line longer than the array, so it never becomes the next answer.</w:t>
       </w:r>
     </w:p>
     <w:p>
@@ -7860,23 +7861,23 @@
         <w:pStyle w:val="SourceCode"/>
       </w:pPr>
       <w:r>
-        <w:t>// Remember, contact_from_row (Lesson 4.6) maps one row (id, name, email,</w:t>
-      </w:r>
-    </w:p>
-    <w:p>
-      <w:pPr>
-        <w:pStyle w:val="SourceCode"/>
-      </w:pPr>
-      <w:r>
-        <w:t>// phone) into a Contact; a NULL phone arrives as a NULL pointer, so</w:t>
-      </w:r>
-    </w:p>
-    <w:p>
-      <w:pPr>
-        <w:pStyle w:val="SourceCode"/>
-      </w:pPr>
-      <w:r>
-        <w:t>// has_phone stays false.</w:t>
+        <w:t>// Remember, contact_from_row (Lesson 4.6) copies a row into a Contact</w:t>
+      </w:r>
+    </w:p>
+    <w:p>
+      <w:pPr>
+        <w:pStyle w:val="SourceCode"/>
+      </w:pPr>
+      <w:r>
+        <w:t>// before mysql_free_result frees it: atoi turns the id's text into an</w:t>
+      </w:r>
+    </w:p>
+    <w:p>
+      <w:pPr>
+        <w:pStyle w:val="SourceCode"/>
+      </w:pPr>
+      <w:r>
+        <w:t>// int, and a NULL phone is a NULL pointer, so has_phone stays false.</w:t>
       </w:r>
     </w:p>
     <w:p>
@@ -9000,23 +9001,23 @@
         <w:pStyle w:val="SourceCode"/>
       </w:pPr>
       <w:r>
-        <w:t>// Remember, read_answer (Lesson 5.1) copies the typed line into answer,</w:t>
-      </w:r>
-    </w:p>
-    <w:p>
-      <w:pPr>
-        <w:pStyle w:val="SourceCode"/>
-      </w:pPr>
-      <w:r>
-        <w:t>// without its \n, and returns true when a line was read or false when</w:t>
-      </w:r>
-    </w:p>
-    <w:p>
-      <w:pPr>
-        <w:pStyle w:val="SourceCode"/>
-      </w:pPr>
-      <w:r>
-        <w:t>// the input had ended; then answer stays empty.</w:t>
+        <w:t>// Remember, read_answer (Lesson 5.1) fills answer without its \n and</w:t>
+      </w:r>
+    </w:p>
+    <w:p>
+      <w:pPr>
+        <w:pStyle w:val="SourceCode"/>
+      </w:pPr>
+      <w:r>
+        <w:t>// returns true, or false when the input had ended; fgetc drops the rest</w:t>
+      </w:r>
+    </w:p>
+    <w:p>
+      <w:pPr>
+        <w:pStyle w:val="SourceCode"/>
+      </w:pPr>
+      <w:r>
+        <w:t>// of a line longer than the array, so it never becomes the next answer.</w:t>
       </w:r>
     </w:p>
     <w:p>
@@ -15432,15 +15433,15 @@
         <w:pStyle w:val="SourceCode"/>
       </w:pPr>
       <w:r>
-        <w:t xml:space="preserve">    // (Lesson 4.10). Remember, @id is a placeholder: the id travels as a</w:t>
-      </w:r>
-    </w:p>
-    <w:p>
-      <w:pPr>
-        <w:pStyle w:val="SourceCode"/>
-      </w:pPr>
-      <w:r>
-        <w:t xml:space="preserve">    // parameter (Lesson 4.5).</w:t>
+        <w:t xml:space="preserve">    // (Lesson 4.10). Remember, @id is a placeholder: the connector fills in</w:t>
+      </w:r>
+    </w:p>
+    <w:p>
+      <w:pPr>
+        <w:pStyle w:val="SourceCode"/>
+      </w:pPr>
+      <w:r>
+        <w:t xml:space="preserve">    // the id safely, writing it into the SQL text (Lesson 4.5).</w:t>
       </w:r>
     </w:p>
     <w:p>
@@ -17548,15 +17549,15 @@
         <w:pStyle w:val="SourceCode"/>
       </w:pPr>
       <w:r>
-        <w:t xml:space="preserve">    // Remember, @id is a placeholder: the id travels as a parameter</w:t>
-      </w:r>
-    </w:p>
-    <w:p>
-      <w:pPr>
-        <w:pStyle w:val="SourceCode"/>
-      </w:pPr>
-      <w:r>
-        <w:t xml:space="preserve">    // (Lesson 4.5).</w:t>
+        <w:t xml:space="preserve">    // Remember, @id is a placeholder: the connector fills in the id safely,</w:t>
+      </w:r>
+    </w:p>
+    <w:p>
+      <w:pPr>
+        <w:pStyle w:val="SourceCode"/>
+      </w:pPr>
+      <w:r>
+        <w:t xml:space="preserve">    // writing it into the SQL text (Lesson 4.5).</w:t>
       </w:r>
     </w:p>
     <w:p>
@@ -25303,15 +25304,15 @@
         <w:pStyle w:val="SourceCode"/>
       </w:pPr>
       <w:r>
-        <w:t># 4.10). Remember, %s is a placeholder: the id travels as a parameter</w:t>
-      </w:r>
-    </w:p>
-    <w:p>
-      <w:pPr>
-        <w:pStyle w:val="SourceCode"/>
-      </w:pPr>
-      <w:r>
-        <w:t># (Lesson 4.5).</w:t>
+        <w:t># 4.10). Remember, %s is a placeholder: the connector fills in the id</w:t>
+      </w:r>
+    </w:p>
+    <w:p>
+      <w:pPr>
+        <w:pStyle w:val="SourceCode"/>
+      </w:pPr>
+      <w:r>
+        <w:t># safely, writing it into the SQL text (Lesson 4.5).</w:t>
       </w:r>
     </w:p>
     <w:p>
@@ -26846,23 +26847,23 @@
         <w:pStyle w:val="SourceCode"/>
       </w:pPr>
       <w:r>
-        <w:t># id (Lesson 4.10). Remember, each %s is a placeholder for a value sent</w:t>
-      </w:r>
-    </w:p>
-    <w:p>
-      <w:pPr>
-        <w:pStyle w:val="SourceCode"/>
-      </w:pPr>
-      <w:r>
-        <w:t># apart from the SQL (Lesson 4.5), and side-by-side literals join into</w:t>
-      </w:r>
-    </w:p>
-    <w:p>
-      <w:pPr>
-        <w:pStyle w:val="SourceCode"/>
-      </w:pPr>
-      <w:r>
-        <w:t># one text (Lesson 4.4).</w:t>
+        <w:t># id (Lesson 4.10). Remember, each %s is a placeholder: the connector</w:t>
+      </w:r>
+    </w:p>
+    <w:p>
+      <w:pPr>
+        <w:pStyle w:val="SourceCode"/>
+      </w:pPr>
+      <w:r>
+        <w:t># fills in each value safely, writing it into the SQL text (Lesson 4.5),</w:t>
+      </w:r>
+    </w:p>
+    <w:p>
+      <w:pPr>
+        <w:pStyle w:val="SourceCode"/>
+      </w:pPr>
+      <w:r>
+        <w:t># and side-by-side literals join into one text (Lesson 4.4).</w:t>
       </w:r>
     </w:p>
     <w:p>
@@ -27124,23 +27125,23 @@
         <w:pStyle w:val="SourceCode"/>
       </w:pPr>
       <w:r>
-        <w:t># Remember, user_message turns a number into words, and a number it does</w:t>
-      </w:r>
-    </w:p>
-    <w:p>
-      <w:pPr>
-        <w:pStyle w:val="SourceCode"/>
-      </w:pPr>
-      <w:r>
-        <w:t># not expect keeps the server's message (Lesson 4.14). Chapter 5 has no</w:t>
-      </w:r>
-    </w:p>
-    <w:p>
-      <w:pPr>
-        <w:pStyle w:val="SourceCode"/>
-      </w:pPr>
-      <w:r>
-        <w:t># groups, so 4.14's 1452 is not listed.</w:t>
+        <w:t># Remember, user_message turns a number into words: match tries each case</w:t>
+      </w:r>
+    </w:p>
+    <w:p>
+      <w:pPr>
+        <w:pStyle w:val="SourceCode"/>
+      </w:pPr>
+      <w:r>
+        <w:t># in turn, and case _ keeps the server's message for any other number</w:t>
+      </w:r>
+    </w:p>
+    <w:p>
+      <w:pPr>
+        <w:pStyle w:val="SourceCode"/>
+      </w:pPr>
+      <w:r>
+        <w:t># (Lesson 4.14). Chapter 5 has no groups, so 4.14's 1452 is not listed.</w:t>
       </w:r>
     </w:p>
     <w:p>
@@ -34559,7 +34560,7 @@
         <w:pStyle w:val="ListBullet"/>
       </w:pPr>
       <w:r>
-        <w:t>Sending the typed id as text and letting the server decide. A parameter keeps the text out of the SQL, but the server turns '2abc' into 2 and shows Grace Hopper. Check the id with parse_id first.</w:t>
+        <w:t>Sending the typed id as text and letting the server decide. A parameter stops the text from becoming SQL, but the server turns '2abc' into 2 and shows Grace Hopper. Check the id with parse_id first.</w:t>
       </w:r>
     </w:p>
     <w:p>
@@ -35721,31 +35722,31 @@
       </w:rPr>
     </w:lvl>
   </w:abstractNum>
-  <w:num w:numId="1" w16cid:durableId="104927284">
+  <w:num w:numId="1" w16cid:durableId="1156455082">
     <w:abstractNumId w:val="8"/>
   </w:num>
-  <w:num w:numId="2" w16cid:durableId="1242057158">
+  <w:num w:numId="2" w16cid:durableId="712311574">
     <w:abstractNumId w:val="6"/>
   </w:num>
-  <w:num w:numId="3" w16cid:durableId="1040934887">
+  <w:num w:numId="3" w16cid:durableId="1346129507">
     <w:abstractNumId w:val="5"/>
   </w:num>
-  <w:num w:numId="4" w16cid:durableId="137384714">
+  <w:num w:numId="4" w16cid:durableId="336882546">
     <w:abstractNumId w:val="4"/>
   </w:num>
-  <w:num w:numId="5" w16cid:durableId="1546602863">
+  <w:num w:numId="5" w16cid:durableId="1210990471">
     <w:abstractNumId w:val="7"/>
   </w:num>
-  <w:num w:numId="6" w16cid:durableId="1638023078">
+  <w:num w:numId="6" w16cid:durableId="738862619">
     <w:abstractNumId w:val="3"/>
   </w:num>
-  <w:num w:numId="7" w16cid:durableId="52429758">
+  <w:num w:numId="7" w16cid:durableId="13725544">
     <w:abstractNumId w:val="2"/>
   </w:num>
-  <w:num w:numId="8" w16cid:durableId="645553088">
+  <w:num w:numId="8" w16cid:durableId="364792175">
     <w:abstractNumId w:val="1"/>
   </w:num>
-  <w:num w:numId="9" w16cid:durableId="480849929">
+  <w:num w:numId="9" w16cid:durableId="875431182">
     <w:abstractNumId w:val="0"/>
   </w:num>
 </w:numbering>

</xml_diff>